<commit_message>
Tuan10/Do_an/Chinh sua lan cuoi file Report.docx
</commit_message>
<xml_diff>
--- a/Do_an/Report.docx
+++ b/Do_an/Report.docx
@@ -680,6 +680,17 @@
             <w:pPr>
               <w:ind w:firstLine="0"/>
             </w:pPr>
+            <w:r>
+              <w:t>Làm 2 model AdaBoost, Gradient Boosting.</w:t>
+            </w:r>
+          </w:p>
+          <w:p>
+            <w:pPr>
+              <w:ind w:firstLine="0"/>
+            </w:pPr>
+            <w:r>
+              <w:t>Làm slide trình diễn.</w:t>
+            </w:r>
           </w:p>
         </w:tc>
       </w:tr>
@@ -718,6 +729,32 @@
             <w:pPr>
               <w:ind w:firstLine="0"/>
             </w:pPr>
+            <w:r>
+              <w:t xml:space="preserve">Làm </w:t>
+            </w:r>
+            <w:r>
+              <w:t>3</w:t>
+            </w:r>
+            <w:r>
+              <w:t xml:space="preserve"> model Kneighbors, LDA</w:t>
+            </w:r>
+            <w:r>
+              <w:t>, SVM.</w:t>
+            </w:r>
+          </w:p>
+          <w:p>
+            <w:pPr>
+              <w:ind w:firstLine="0"/>
+            </w:pPr>
+            <w:r>
+              <w:t>Làm phần V</w:t>
+            </w:r>
+            <w:r>
+              <w:t>, VI</w:t>
+            </w:r>
+            <w:r>
+              <w:t>.</w:t>
+            </w:r>
           </w:p>
         </w:tc>
       </w:tr>
@@ -756,6 +793,23 @@
             <w:pPr>
               <w:ind w:firstLine="0"/>
             </w:pPr>
+            <w:r>
+              <w:t>Làm 3 model Decision Tree,</w:t>
+            </w:r>
+            <w:r>
+              <w:t xml:space="preserve"> LR</w:t>
+            </w:r>
+            <w:r>
+              <w:t>, Random Forest.</w:t>
+            </w:r>
+          </w:p>
+          <w:p>
+            <w:pPr>
+              <w:ind w:firstLine="0"/>
+            </w:pPr>
+            <w:r>
+              <w:t>Làm phần IV.</w:t>
+            </w:r>
           </w:p>
         </w:tc>
       </w:tr>
@@ -794,6 +848,20 @@
             <w:pPr>
               <w:ind w:firstLine="0"/>
             </w:pPr>
+            <w:r>
+              <w:t xml:space="preserve">Làm 2 model </w:t>
+            </w:r>
+            <w:r>
+              <w:t>MLP, Naive Bayes.</w:t>
+            </w:r>
+          </w:p>
+          <w:p>
+            <w:pPr>
+              <w:ind w:firstLine="0"/>
+            </w:pPr>
+            <w:r>
+              <w:t>Làm báo cáo word phần I, II, III.</w:t>
+            </w:r>
           </w:p>
         </w:tc>
       </w:tr>

</xml_diff>